<commit_message>
Update DH project and intro website
</commit_message>
<xml_diff>
--- a/Outline/Part 1.docx
+++ b/Outline/Part 1.docx
@@ -2,7 +2,1586 @@
 <file path=word/document.xml><?xml version="1.0" encoding="utf-8"?>
 <w:document xmlns:wpc="http://schemas.microsoft.com/office/word/2010/wordprocessingCanvas" xmlns:cx="http://schemas.microsoft.com/office/drawing/2014/chartex" xmlns:cx1="http://schemas.microsoft.com/office/drawing/2015/9/8/chartex" xmlns:cx2="http://schemas.microsoft.com/office/drawing/2015/10/21/chartex" xmlns:cx3="http://schemas.microsoft.com/office/drawing/2016/5/9/chartex" xmlns:cx4="http://schemas.microsoft.com/office/drawing/2016/5/10/chartex" xmlns:cx5="http://schemas.microsoft.com/office/drawing/2016/5/11/chartex" xmlns:cx6="http://schemas.microsoft.com/office/drawing/2016/5/12/chartex" xmlns:cx7="http://schemas.microsoft.com/office/drawing/2016/5/13/chartex" xmlns:cx8="http://schemas.microsoft.com/office/drawing/2016/5/14/chartex" xmlns:mc="http://schemas.openxmlformats.org/markup-compatibility/2006" xmlns:aink="http://schemas.microsoft.com/office/drawing/2016/ink" xmlns:am3d="http://schemas.microsoft.com/office/drawing/2017/model3d" xmlns:o="urn:schemas-microsoft-com:office:office" xmlns:oel="http://schemas.microsoft.com/office/2019/extlst" xmlns:r="http://schemas.openxmlformats.org/officeDocument/2006/relationships" xmlns:m="http://schemas.openxmlformats.org/officeDocument/2006/math" xmlns:v="urn:schemas-microsoft-com:vml" xmlns:wp14="http://schemas.microsoft.com/office/word/2010/wordprocessingDrawing" xmlns:wp="http://schemas.openxmlformats.org/drawingml/2006/wordprocessingDrawing" xmlns:w10="urn:schemas-microsoft-com:office:word" xmlns:w="http://schemas.openxmlformats.org/wordprocessingml/2006/main" xmlns:w14="http://schemas.microsoft.com/office/word/2010/wordml" xmlns:w15="http://schemas.microsoft.com/office/word/2012/wordml" xmlns:w16cex="http://schemas.microsoft.com/office/word/2018/wordml/cex" xmlns:w16cid="http://schemas.microsoft.com/office/word/2016/wordml/cid" xmlns:w16="http://schemas.microsoft.com/office/word/2018/wordml" xmlns:w16du="http://schemas.microsoft.com/office/word/2023/wordml/word16du" xmlns:w16sdtdh="http://schemas.microsoft.com/office/word/2020/wordml/sdtdatahash" xmlns:w16sdtfl="http://schemas.microsoft.com/office/word/2024/wordml/sdtformatlock" xmlns:w16se="http://schemas.microsoft.com/office/word/2015/wordml/symex" xmlns:wpg="http://schemas.microsoft.com/office/word/2010/wordprocessingGroup" xmlns:wpi="http://schemas.microsoft.com/office/word/2010/wordprocessingInk" xmlns:wne="http://schemas.microsoft.com/office/word/2006/wordml" xmlns:wps="http://schemas.microsoft.com/office/word/2010/wordprocessingShape" mc:Ignorable="w14 w15 w16se w16cid w16 w16cex w16sdtdh w16sdtfl w16du wp14">
   <w:body>
-    <w:p/>
+    <w:p>
+      <w:pPr>
+        <w:rPr>
+          <w:rFonts w:ascii="PMingLiU" w:eastAsia="PMingLiU" w:hAnsi="PMingLiU"/>
+          <w:color w:val="000000" w:themeColor="text1"/>
+          <w:sz w:val="22"/>
+          <w:szCs w:val="22"/>
+        </w:rPr>
+      </w:pPr>
+      <w:r>
+        <w:rPr>
+          <w:rFonts w:ascii="PMingLiU" w:eastAsia="PMingLiU" w:hAnsi="PMingLiU"/>
+          <w:color w:val="000000" w:themeColor="text1"/>
+          <w:sz w:val="22"/>
+          <w:szCs w:val="22"/>
+        </w:rPr>
+        <w:tab/>
+      </w:r>
+      <w:r>
+        <w:rPr>
+          <w:rFonts w:ascii="PMingLiU" w:eastAsia="PMingLiU" w:hAnsi="PMingLiU" w:hint="eastAsia"/>
+          <w:color w:val="000000" w:themeColor="text1"/>
+          <w:sz w:val="22"/>
+          <w:szCs w:val="22"/>
+        </w:rPr>
+        <w:t>1. 平台</w:t>
+      </w:r>
+      <w:r>
+        <w:rPr>
+          <w:rFonts w:ascii="PMingLiU" w:eastAsia="PMingLiU" w:hAnsi="PMingLiU" w:hint="eastAsia"/>
+          <w:color w:val="000000" w:themeColor="text1"/>
+          <w:sz w:val="22"/>
+          <w:szCs w:val="22"/>
+        </w:rPr>
+        <w:t>的</w:t>
+      </w:r>
+      <w:r>
+        <w:rPr>
+          <w:rFonts w:ascii="PMingLiU" w:eastAsia="PMingLiU" w:hAnsi="PMingLiU" w:hint="eastAsia"/>
+          <w:color w:val="000000" w:themeColor="text1"/>
+          <w:sz w:val="22"/>
+          <w:szCs w:val="22"/>
+        </w:rPr>
+        <w:t>整體介面</w:t>
+      </w:r>
+    </w:p>
+    <w:p>
+      <w:pPr>
+        <w:rPr>
+          <w:rFonts w:ascii="PMingLiU" w:eastAsia="PMingLiU" w:hAnsi="PMingLiU" w:cstheme="majorBidi"/>
+          <w:color w:val="000000" w:themeColor="text1"/>
+          <w:sz w:val="22"/>
+          <w:szCs w:val="22"/>
+        </w:rPr>
+      </w:pPr>
+      <w:r>
+        <w:rPr>
+          <w:rFonts w:ascii="PMingLiU" w:eastAsia="PMingLiU" w:hAnsi="PMingLiU" w:cstheme="majorBidi" w:hint="eastAsia"/>
+          <w:color w:val="000000" w:themeColor="text1"/>
+          <w:sz w:val="22"/>
+          <w:szCs w:val="22"/>
+        </w:rPr>
+        <w:t>本部分</w:t>
+      </w:r>
+      <w:r>
+        <w:rPr>
+          <w:rFonts w:ascii="PMingLiU" w:eastAsia="PMingLiU" w:hAnsi="PMingLiU" w:cstheme="majorBidi" w:hint="eastAsia"/>
+          <w:color w:val="000000" w:themeColor="text1"/>
+          <w:sz w:val="22"/>
+          <w:szCs w:val="22"/>
+        </w:rPr>
+        <w:t>會先</w:t>
+      </w:r>
+      <w:r>
+        <w:rPr>
+          <w:rFonts w:ascii="PMingLiU" w:eastAsia="PMingLiU" w:hAnsi="PMingLiU" w:cstheme="majorBidi" w:hint="eastAsia"/>
+          <w:color w:val="000000" w:themeColor="text1"/>
+          <w:sz w:val="22"/>
+          <w:szCs w:val="22"/>
+        </w:rPr>
+        <w:t>介紹平台的整體介面</w:t>
+      </w:r>
+      <w:r>
+        <w:rPr>
+          <w:rFonts w:ascii="PMingLiU" w:eastAsia="PMingLiU" w:hAnsi="PMingLiU" w:cstheme="majorBidi" w:hint="eastAsia"/>
+          <w:color w:val="000000" w:themeColor="text1"/>
+          <w:sz w:val="22"/>
+          <w:szCs w:val="22"/>
+        </w:rPr>
+        <w:t>，再逐步</w:t>
+      </w:r>
+      <w:r>
+        <w:rPr>
+          <w:rFonts w:ascii="PMingLiU" w:eastAsia="PMingLiU" w:hAnsi="PMingLiU" w:cstheme="majorBidi" w:hint="eastAsia"/>
+          <w:color w:val="000000" w:themeColor="text1"/>
+          <w:sz w:val="22"/>
+          <w:szCs w:val="22"/>
+        </w:rPr>
+        <w:t>說明</w:t>
+      </w:r>
+      <w:r>
+        <w:rPr>
+          <w:rFonts w:ascii="PMingLiU" w:eastAsia="PMingLiU" w:hAnsi="PMingLiU" w:cstheme="majorBidi" w:hint="eastAsia"/>
+          <w:color w:val="000000" w:themeColor="text1"/>
+          <w:sz w:val="22"/>
+          <w:szCs w:val="22"/>
+        </w:rPr>
+        <w:t>平台的運作流程。</w:t>
+      </w:r>
+    </w:p>
+    <w:p>
+      <w:pPr>
+        <w:rPr>
+          <w:rFonts w:ascii="PMingLiU" w:eastAsia="PMingLiU" w:hAnsi="PMingLiU"/>
+          <w:color w:val="000000" w:themeColor="text1"/>
+          <w:sz w:val="22"/>
+          <w:szCs w:val="22"/>
+        </w:rPr>
+      </w:pPr>
+    </w:p>
+    <w:p>
+      <w:pPr>
+        <w:rPr>
+          <w:rFonts w:ascii="PMingLiU" w:eastAsia="PMingLiU" w:hAnsi="PMingLiU"/>
+          <w:color w:val="000000" w:themeColor="text1"/>
+          <w:sz w:val="22"/>
+          <w:szCs w:val="22"/>
+        </w:rPr>
+      </w:pPr>
+      <w:r>
+        <w:rPr>
+          <w:rFonts w:ascii="PMingLiU" w:eastAsia="PMingLiU" w:hAnsi="PMingLiU"/>
+          <w:color w:val="000000" w:themeColor="text1"/>
+          <w:sz w:val="22"/>
+          <w:szCs w:val="22"/>
+        </w:rPr>
+        <w:tab/>
+      </w:r>
+      <w:r>
+        <w:rPr>
+          <w:rFonts w:ascii="PMingLiU" w:eastAsia="PMingLiU" w:hAnsi="PMingLiU"/>
+          <w:color w:val="000000" w:themeColor="text1"/>
+          <w:sz w:val="22"/>
+          <w:szCs w:val="22"/>
+        </w:rPr>
+        <w:tab/>
+      </w:r>
+      <w:r>
+        <w:rPr>
+          <w:rFonts w:ascii="PMingLiU" w:eastAsia="PMingLiU" w:hAnsi="PMingLiU" w:hint="eastAsia"/>
+          <w:color w:val="000000" w:themeColor="text1"/>
+          <w:sz w:val="22"/>
+          <w:szCs w:val="22"/>
+        </w:rPr>
+        <w:t xml:space="preserve">1. </w:t>
+      </w:r>
+      <w:r>
+        <w:rPr>
+          <w:rFonts w:ascii="PMingLiU" w:eastAsia="PMingLiU" w:hAnsi="PMingLiU" w:hint="eastAsia"/>
+          <w:color w:val="000000" w:themeColor="text1"/>
+          <w:sz w:val="22"/>
+          <w:szCs w:val="22"/>
+        </w:rPr>
+        <w:t>平台</w:t>
+      </w:r>
+      <w:r>
+        <w:rPr>
+          <w:rFonts w:ascii="PMingLiU" w:eastAsia="PMingLiU" w:hAnsi="PMingLiU" w:hint="eastAsia"/>
+          <w:color w:val="000000" w:themeColor="text1"/>
+          <w:sz w:val="22"/>
+          <w:szCs w:val="22"/>
+        </w:rPr>
+        <w:t>的四大區域</w:t>
+      </w:r>
+    </w:p>
+    <w:p>
+      <w:pPr>
+        <w:rPr>
+          <w:rFonts w:ascii="PMingLiU" w:eastAsia="PMingLiU" w:hAnsi="PMingLiU" w:hint="eastAsia"/>
+          <w:color w:val="000000" w:themeColor="text1"/>
+          <w:sz w:val="22"/>
+          <w:szCs w:val="22"/>
+          <w:lang w:val="en-US"/>
+        </w:rPr>
+      </w:pPr>
+      <w:r>
+        <w:rPr>
+          <w:rFonts w:ascii="PMingLiU" w:eastAsia="PMingLiU" w:hAnsi="PMingLiU" w:hint="eastAsia"/>
+          <w:color w:val="000000" w:themeColor="text1"/>
+          <w:sz w:val="22"/>
+          <w:szCs w:val="22"/>
+        </w:rPr>
+        <w:t>平台介面主要由四個區域組成，分別是導覽列、時間與關係圖表、</w:t>
+      </w:r>
+      <w:r>
+        <w:rPr>
+          <w:rFonts w:ascii="PMingLiU" w:eastAsia="PMingLiU" w:hAnsi="PMingLiU" w:hint="eastAsia"/>
+          <w:color w:val="000000" w:themeColor="text1"/>
+          <w:sz w:val="22"/>
+          <w:szCs w:val="22"/>
+        </w:rPr>
+        <w:t>原始史料</w:t>
+      </w:r>
+      <w:r>
+        <w:rPr>
+          <w:rFonts w:ascii="PMingLiU" w:eastAsia="PMingLiU" w:hAnsi="PMingLiU" w:hint="eastAsia"/>
+          <w:color w:val="000000" w:themeColor="text1"/>
+          <w:sz w:val="22"/>
+          <w:szCs w:val="22"/>
+        </w:rPr>
+        <w:t>區，以及</w:t>
+      </w:r>
+      <w:r>
+        <w:rPr>
+          <w:rFonts w:ascii="PMingLiU" w:eastAsia="PMingLiU" w:hAnsi="PMingLiU" w:hint="eastAsia"/>
+          <w:color w:val="000000" w:themeColor="text1"/>
+          <w:sz w:val="22"/>
+          <w:szCs w:val="22"/>
+        </w:rPr>
+        <w:t>AI分</w:t>
+      </w:r>
+      <w:r>
+        <w:rPr>
+          <w:rFonts w:ascii="PMingLiU" w:eastAsia="PMingLiU" w:hAnsi="PMingLiU" w:hint="eastAsia"/>
+          <w:color w:val="000000" w:themeColor="text1"/>
+          <w:sz w:val="22"/>
+          <w:szCs w:val="22"/>
+        </w:rPr>
+        <w:t>析區。</w:t>
+      </w:r>
+    </w:p>
+    <w:p>
+      <w:pPr>
+        <w:rPr>
+          <w:rFonts w:ascii="PMingLiU" w:eastAsia="PMingLiU" w:hAnsi="PMingLiU"/>
+          <w:color w:val="000000" w:themeColor="text1"/>
+          <w:sz w:val="22"/>
+          <w:szCs w:val="22"/>
+        </w:rPr>
+      </w:pPr>
+    </w:p>
+    <w:p>
+      <w:pPr>
+        <w:rPr>
+          <w:rFonts w:ascii="PMingLiU" w:eastAsia="PMingLiU" w:hAnsi="PMingLiU" w:hint="eastAsia"/>
+          <w:color w:val="000000" w:themeColor="text1"/>
+          <w:sz w:val="22"/>
+          <w:szCs w:val="22"/>
+        </w:rPr>
+      </w:pPr>
+      <w:r>
+        <w:rPr>
+          <w:rFonts w:ascii="PMingLiU" w:eastAsia="PMingLiU" w:hAnsi="PMingLiU" w:hint="eastAsia"/>
+          <w:color w:val="000000" w:themeColor="text1"/>
+          <w:sz w:val="22"/>
+          <w:szCs w:val="22"/>
+        </w:rPr>
+        <w:t>導覽列：介面區域切換</w:t>
+      </w:r>
+      <w:r>
+        <w:rPr>
+          <w:rFonts w:ascii="PMingLiU" w:eastAsia="PMingLiU" w:hAnsi="PMingLiU" w:hint="eastAsia"/>
+          <w:color w:val="000000" w:themeColor="text1"/>
+          <w:sz w:val="22"/>
+          <w:szCs w:val="22"/>
+        </w:rPr>
+        <w:t>、</w:t>
+      </w:r>
+      <w:r>
+        <w:rPr>
+          <w:rFonts w:ascii="PMingLiU" w:eastAsia="PMingLiU" w:hAnsi="PMingLiU" w:hint="eastAsia"/>
+          <w:color w:val="000000" w:themeColor="text1"/>
+          <w:sz w:val="22"/>
+          <w:szCs w:val="22"/>
+        </w:rPr>
+        <w:t>資料輸入與輸出</w:t>
+      </w:r>
+      <w:r>
+        <w:rPr>
+          <w:rFonts w:ascii="PMingLiU" w:eastAsia="PMingLiU" w:hAnsi="PMingLiU" w:hint="eastAsia"/>
+          <w:color w:val="000000" w:themeColor="text1"/>
+          <w:sz w:val="22"/>
+          <w:szCs w:val="22"/>
+        </w:rPr>
+        <w:t>，以及修改顯示設定</w:t>
+      </w:r>
+      <w:r>
+        <w:rPr>
+          <w:rFonts w:ascii="PMingLiU" w:eastAsia="PMingLiU" w:hAnsi="PMingLiU" w:hint="eastAsia"/>
+          <w:color w:val="000000" w:themeColor="text1"/>
+          <w:sz w:val="22"/>
+          <w:szCs w:val="22"/>
+        </w:rPr>
+        <w:t>。</w:t>
+      </w:r>
+    </w:p>
+    <w:p>
+      <w:pPr>
+        <w:rPr>
+          <w:rFonts w:ascii="PMingLiU" w:eastAsia="PMingLiU" w:hAnsi="PMingLiU" w:hint="eastAsia"/>
+          <w:color w:val="000000" w:themeColor="text1"/>
+          <w:sz w:val="22"/>
+          <w:szCs w:val="22"/>
+        </w:rPr>
+      </w:pPr>
+      <w:r>
+        <w:rPr>
+          <w:rFonts w:ascii="PMingLiU" w:eastAsia="PMingLiU" w:hAnsi="PMingLiU" w:hint="eastAsia"/>
+          <w:color w:val="000000" w:themeColor="text1"/>
+          <w:sz w:val="22"/>
+          <w:szCs w:val="22"/>
+        </w:rPr>
+        <w:t>時間與關係圖表：呈現文書與事件的時間順序及相互聯繫。</w:t>
+      </w:r>
+    </w:p>
+    <w:p>
+      <w:pPr>
+        <w:rPr>
+          <w:rFonts w:ascii="PMingLiU" w:eastAsia="PMingLiU" w:hAnsi="PMingLiU" w:hint="eastAsia"/>
+          <w:color w:val="000000" w:themeColor="text1"/>
+          <w:sz w:val="22"/>
+          <w:szCs w:val="22"/>
+        </w:rPr>
+      </w:pPr>
+      <w:r>
+        <w:rPr>
+          <w:rFonts w:ascii="PMingLiU" w:eastAsia="PMingLiU" w:hAnsi="PMingLiU" w:hint="eastAsia"/>
+          <w:color w:val="000000" w:themeColor="text1"/>
+          <w:sz w:val="22"/>
+          <w:szCs w:val="22"/>
+        </w:rPr>
+        <w:t>原始史料區：顯示文書的基本資料</w:t>
+      </w:r>
+      <w:r>
+        <w:rPr>
+          <w:rFonts w:ascii="PMingLiU" w:eastAsia="PMingLiU" w:hAnsi="PMingLiU" w:hint="eastAsia"/>
+          <w:color w:val="000000" w:themeColor="text1"/>
+          <w:sz w:val="22"/>
+          <w:szCs w:val="22"/>
+        </w:rPr>
+        <w:t>及</w:t>
+      </w:r>
+      <w:r>
+        <w:rPr>
+          <w:rFonts w:ascii="PMingLiU" w:eastAsia="PMingLiU" w:hAnsi="PMingLiU" w:hint="eastAsia"/>
+          <w:color w:val="000000" w:themeColor="text1"/>
+          <w:sz w:val="22"/>
+          <w:szCs w:val="22"/>
+        </w:rPr>
+        <w:t>完整原文。</w:t>
+      </w:r>
+    </w:p>
+    <w:p>
+      <w:pPr>
+        <w:rPr>
+          <w:rFonts w:ascii="PMingLiU" w:eastAsia="PMingLiU" w:hAnsi="PMingLiU"/>
+          <w:color w:val="000000" w:themeColor="text1"/>
+          <w:sz w:val="22"/>
+          <w:szCs w:val="22"/>
+        </w:rPr>
+      </w:pPr>
+      <w:r>
+        <w:rPr>
+          <w:rFonts w:ascii="PMingLiU" w:eastAsia="PMingLiU" w:hAnsi="PMingLiU" w:hint="eastAsia"/>
+          <w:color w:val="000000" w:themeColor="text1"/>
+          <w:sz w:val="22"/>
+          <w:szCs w:val="22"/>
+        </w:rPr>
+        <w:t>AI 分析區：展示人工智能從文書中提取的資訊，供研究者檢視。</w:t>
+      </w:r>
+    </w:p>
+    <w:p>
+      <w:pPr>
+        <w:rPr>
+          <w:rFonts w:ascii="PMingLiU" w:eastAsia="PMingLiU" w:hAnsi="PMingLiU"/>
+          <w:color w:val="000000" w:themeColor="text1"/>
+          <w:sz w:val="22"/>
+          <w:szCs w:val="22"/>
+        </w:rPr>
+      </w:pPr>
+    </w:p>
+    <w:p>
+      <w:pPr>
+        <w:rPr>
+          <w:rFonts w:ascii="PMingLiU" w:eastAsia="PMingLiU" w:hAnsi="PMingLiU" w:hint="eastAsia"/>
+          <w:color w:val="000000" w:themeColor="text1"/>
+          <w:sz w:val="22"/>
+          <w:szCs w:val="22"/>
+        </w:rPr>
+      </w:pPr>
+      <w:r>
+        <w:rPr>
+          <w:rFonts w:ascii="PMingLiU" w:eastAsia="PMingLiU" w:hAnsi="PMingLiU"/>
+          <w:color w:val="000000" w:themeColor="text1"/>
+          <w:sz w:val="22"/>
+          <w:szCs w:val="22"/>
+        </w:rPr>
+        <w:tab/>
+      </w:r>
+      <w:r>
+        <w:rPr>
+          <w:rFonts w:ascii="PMingLiU" w:eastAsia="PMingLiU" w:hAnsi="PMingLiU"/>
+          <w:color w:val="000000" w:themeColor="text1"/>
+          <w:sz w:val="22"/>
+          <w:szCs w:val="22"/>
+        </w:rPr>
+        <w:tab/>
+      </w:r>
+      <w:r>
+        <w:rPr>
+          <w:rFonts w:ascii="PMingLiU" w:eastAsia="PMingLiU" w:hAnsi="PMingLiU" w:hint="eastAsia"/>
+          <w:color w:val="000000" w:themeColor="text1"/>
+          <w:sz w:val="22"/>
+          <w:szCs w:val="22"/>
+        </w:rPr>
+        <w:t xml:space="preserve">2. </w:t>
+      </w:r>
+      <w:r>
+        <w:rPr>
+          <w:rFonts w:ascii="PMingLiU" w:eastAsia="PMingLiU" w:hAnsi="PMingLiU" w:hint="eastAsia"/>
+          <w:color w:val="000000" w:themeColor="text1"/>
+          <w:sz w:val="22"/>
+          <w:szCs w:val="22"/>
+        </w:rPr>
+        <w:t>導覽列</w:t>
+      </w:r>
+    </w:p>
+    <w:p>
+      <w:pPr>
+        <w:rPr>
+          <w:rFonts w:ascii="PMingLiU" w:eastAsia="PMingLiU" w:hAnsi="PMingLiU"/>
+          <w:color w:val="000000" w:themeColor="text1"/>
+          <w:sz w:val="22"/>
+          <w:szCs w:val="22"/>
+        </w:rPr>
+      </w:pPr>
+    </w:p>
+    <w:p>
+      <w:pPr>
+        <w:rPr>
+          <w:rFonts w:ascii="PMingLiU" w:eastAsia="PMingLiU" w:hAnsi="PMingLiU" w:hint="eastAsia"/>
+          <w:color w:val="000000" w:themeColor="text1"/>
+          <w:sz w:val="22"/>
+          <w:szCs w:val="22"/>
+        </w:rPr>
+      </w:pPr>
+      <w:r>
+        <w:rPr>
+          <w:rFonts w:ascii="PMingLiU" w:eastAsia="PMingLiU" w:hAnsi="PMingLiU"/>
+          <w:color w:val="000000" w:themeColor="text1"/>
+          <w:sz w:val="22"/>
+          <w:szCs w:val="22"/>
+        </w:rPr>
+        <w:tab/>
+      </w:r>
+      <w:r>
+        <w:rPr>
+          <w:rFonts w:ascii="PMingLiU" w:eastAsia="PMingLiU" w:hAnsi="PMingLiU"/>
+          <w:color w:val="000000" w:themeColor="text1"/>
+          <w:sz w:val="22"/>
+          <w:szCs w:val="22"/>
+        </w:rPr>
+        <w:tab/>
+      </w:r>
+      <w:r>
+        <w:rPr>
+          <w:rFonts w:ascii="PMingLiU" w:eastAsia="PMingLiU" w:hAnsi="PMingLiU"/>
+          <w:color w:val="000000" w:themeColor="text1"/>
+          <w:sz w:val="22"/>
+          <w:szCs w:val="22"/>
+        </w:rPr>
+        <w:tab/>
+      </w:r>
+      <w:r>
+        <w:rPr>
+          <w:rFonts w:ascii="PMingLiU" w:eastAsia="PMingLiU" w:hAnsi="PMingLiU" w:hint="eastAsia"/>
+          <w:color w:val="000000" w:themeColor="text1"/>
+          <w:sz w:val="22"/>
+          <w:szCs w:val="22"/>
+        </w:rPr>
+        <w:t>1.</w:t>
+      </w:r>
+      <w:r>
+        <w:rPr>
+          <w:rFonts w:ascii="PMingLiU" w:eastAsia="PMingLiU" w:hAnsi="PMingLiU" w:hint="eastAsia"/>
+          <w:color w:val="000000" w:themeColor="text1"/>
+          <w:sz w:val="22"/>
+          <w:szCs w:val="22"/>
+        </w:rPr>
+        <w:t xml:space="preserve"> </w:t>
+      </w:r>
+      <w:r>
+        <w:rPr>
+          <w:rFonts w:ascii="PMingLiU" w:eastAsia="PMingLiU" w:hAnsi="PMingLiU" w:hint="eastAsia"/>
+          <w:color w:val="000000" w:themeColor="text1"/>
+          <w:sz w:val="22"/>
+          <w:szCs w:val="22"/>
+        </w:rPr>
+        <w:t>輸入與輸出</w:t>
+      </w:r>
+      <w:r>
+        <w:rPr>
+          <w:rFonts w:ascii="PMingLiU" w:eastAsia="PMingLiU" w:hAnsi="PMingLiU" w:hint="eastAsia"/>
+          <w:color w:val="000000" w:themeColor="text1"/>
+          <w:sz w:val="22"/>
+          <w:szCs w:val="22"/>
+        </w:rPr>
+        <w:t>資料</w:t>
+      </w:r>
+    </w:p>
+    <w:p>
+      <w:pPr>
+        <w:rPr>
+          <w:rFonts w:ascii="PMingLiU" w:eastAsia="PMingLiU" w:hAnsi="PMingLiU"/>
+          <w:color w:val="000000" w:themeColor="text1"/>
+          <w:sz w:val="22"/>
+          <w:szCs w:val="22"/>
+        </w:rPr>
+      </w:pPr>
+      <w:r>
+        <w:rPr>
+          <w:rFonts w:ascii="PMingLiU" w:eastAsia="PMingLiU" w:hAnsi="PMingLiU" w:hint="eastAsia"/>
+          <w:color w:val="000000" w:themeColor="text1"/>
+          <w:sz w:val="22"/>
+          <w:szCs w:val="22"/>
+        </w:rPr>
+        <w:t>研究者可以從本機輸入結構化的原始文本</w:t>
+      </w:r>
+      <w:r>
+        <w:rPr>
+          <w:rFonts w:ascii="PMingLiU" w:eastAsia="PMingLiU" w:hAnsi="PMingLiU" w:hint="eastAsia"/>
+          <w:color w:val="000000" w:themeColor="text1"/>
+          <w:sz w:val="22"/>
+          <w:szCs w:val="22"/>
+        </w:rPr>
+        <w:t>和</w:t>
+      </w:r>
+      <w:r>
+        <w:rPr>
+          <w:rFonts w:ascii="PMingLiU" w:eastAsia="PMingLiU" w:hAnsi="PMingLiU" w:hint="eastAsia"/>
+          <w:color w:val="000000" w:themeColor="text1"/>
+          <w:sz w:val="22"/>
+          <w:szCs w:val="22"/>
+        </w:rPr>
+        <w:t>AI 分析結果；完成檢視和修改後，亦可以將結構化資料輸出至本機，供後續研究使用。</w:t>
+      </w:r>
+    </w:p>
+    <w:p>
+      <w:pPr>
+        <w:rPr>
+          <w:rFonts w:ascii="PMingLiU" w:eastAsia="PMingLiU" w:hAnsi="PMingLiU" w:hint="eastAsia"/>
+          <w:color w:val="000000" w:themeColor="text1"/>
+          <w:sz w:val="22"/>
+          <w:szCs w:val="22"/>
+        </w:rPr>
+      </w:pPr>
+    </w:p>
+    <w:p>
+      <w:pPr>
+        <w:rPr>
+          <w:rFonts w:ascii="PMingLiU" w:eastAsia="PMingLiU" w:hAnsi="PMingLiU"/>
+          <w:color w:val="000000" w:themeColor="text1"/>
+          <w:sz w:val="22"/>
+          <w:szCs w:val="22"/>
+        </w:rPr>
+      </w:pPr>
+      <w:r>
+        <w:rPr>
+          <w:rFonts w:ascii="PMingLiU" w:eastAsia="PMingLiU" w:hAnsi="PMingLiU"/>
+          <w:color w:val="000000" w:themeColor="text1"/>
+          <w:sz w:val="22"/>
+          <w:szCs w:val="22"/>
+        </w:rPr>
+        <w:tab/>
+      </w:r>
+      <w:r>
+        <w:rPr>
+          <w:rFonts w:ascii="PMingLiU" w:eastAsia="PMingLiU" w:hAnsi="PMingLiU"/>
+          <w:color w:val="000000" w:themeColor="text1"/>
+          <w:sz w:val="22"/>
+          <w:szCs w:val="22"/>
+        </w:rPr>
+        <w:tab/>
+      </w:r>
+      <w:r>
+        <w:rPr>
+          <w:rFonts w:ascii="PMingLiU" w:eastAsia="PMingLiU" w:hAnsi="PMingLiU"/>
+          <w:color w:val="000000" w:themeColor="text1"/>
+          <w:sz w:val="22"/>
+          <w:szCs w:val="22"/>
+        </w:rPr>
+        <w:tab/>
+      </w:r>
+      <w:r>
+        <w:rPr>
+          <w:rFonts w:ascii="PMingLiU" w:eastAsia="PMingLiU" w:hAnsi="PMingLiU" w:hint="eastAsia"/>
+          <w:color w:val="000000" w:themeColor="text1"/>
+          <w:sz w:val="22"/>
+          <w:szCs w:val="22"/>
+        </w:rPr>
+        <w:t xml:space="preserve">2. </w:t>
+      </w:r>
+      <w:r>
+        <w:rPr>
+          <w:rFonts w:ascii="PMingLiU" w:eastAsia="PMingLiU" w:hAnsi="PMingLiU" w:hint="eastAsia"/>
+          <w:color w:val="000000" w:themeColor="text1"/>
+          <w:sz w:val="22"/>
+          <w:szCs w:val="22"/>
+        </w:rPr>
+        <w:t>切換</w:t>
+      </w:r>
+      <w:r>
+        <w:rPr>
+          <w:rFonts w:ascii="PMingLiU" w:eastAsia="PMingLiU" w:hAnsi="PMingLiU" w:hint="eastAsia"/>
+          <w:color w:val="000000" w:themeColor="text1"/>
+          <w:sz w:val="22"/>
+          <w:szCs w:val="22"/>
+        </w:rPr>
+        <w:t>介面區域</w:t>
+      </w:r>
+    </w:p>
+    <w:p>
+      <w:pPr>
+        <w:rPr>
+          <w:rFonts w:ascii="PMingLiU" w:eastAsia="PMingLiU" w:hAnsi="PMingLiU"/>
+          <w:color w:val="000000" w:themeColor="text1"/>
+          <w:sz w:val="22"/>
+          <w:szCs w:val="22"/>
+        </w:rPr>
+      </w:pPr>
+      <w:r>
+        <w:rPr>
+          <w:rFonts w:ascii="PMingLiU" w:eastAsia="PMingLiU" w:hAnsi="PMingLiU" w:hint="eastAsia"/>
+          <w:color w:val="000000" w:themeColor="text1"/>
+          <w:sz w:val="22"/>
+          <w:szCs w:val="22"/>
+        </w:rPr>
+        <w:t>研究者可以透過導覽列切換不同的介面區域。例如，在閱讀原文後，開啟 AI 分析區，檢視人工智能提取的資訊</w:t>
+      </w:r>
+      <w:r>
+        <w:rPr>
+          <w:rFonts w:ascii="PMingLiU" w:eastAsia="PMingLiU" w:hAnsi="PMingLiU" w:hint="eastAsia"/>
+          <w:color w:val="000000" w:themeColor="text1"/>
+          <w:sz w:val="22"/>
+          <w:szCs w:val="22"/>
+        </w:rPr>
+        <w:t>，</w:t>
+      </w:r>
+      <w:r>
+        <w:rPr>
+          <w:rFonts w:ascii="PMingLiU" w:eastAsia="PMingLiU" w:hAnsi="PMingLiU" w:hint="eastAsia"/>
+          <w:color w:val="000000" w:themeColor="text1"/>
+          <w:sz w:val="22"/>
+          <w:szCs w:val="22"/>
+        </w:rPr>
+        <w:t>同時開啟筆記頁，記錄閱讀所得</w:t>
+      </w:r>
+      <w:r>
+        <w:rPr>
+          <w:rFonts w:ascii="PMingLiU" w:eastAsia="PMingLiU" w:hAnsi="PMingLiU" w:hint="eastAsia"/>
+          <w:color w:val="000000" w:themeColor="text1"/>
+          <w:sz w:val="22"/>
+          <w:szCs w:val="22"/>
+        </w:rPr>
+        <w:t>，並在</w:t>
+      </w:r>
+      <w:r>
+        <w:rPr>
+          <w:rFonts w:ascii="PMingLiU" w:eastAsia="PMingLiU" w:hAnsi="PMingLiU" w:hint="eastAsia"/>
+          <w:color w:val="000000" w:themeColor="text1"/>
+          <w:sz w:val="22"/>
+          <w:szCs w:val="22"/>
+        </w:rPr>
+        <w:t>完成審閱後，</w:t>
+      </w:r>
+      <w:r>
+        <w:rPr>
+          <w:rFonts w:ascii="PMingLiU" w:eastAsia="PMingLiU" w:hAnsi="PMingLiU" w:hint="eastAsia"/>
+          <w:color w:val="000000" w:themeColor="text1"/>
+          <w:sz w:val="22"/>
+          <w:szCs w:val="22"/>
+        </w:rPr>
+        <w:t>點擊「</w:t>
+      </w:r>
+      <w:r>
+        <w:rPr>
+          <w:rFonts w:ascii="PMingLiU" w:eastAsia="PMingLiU" w:hAnsi="PMingLiU" w:hint="eastAsia"/>
+          <w:color w:val="000000" w:themeColor="text1"/>
+          <w:sz w:val="22"/>
+          <w:szCs w:val="22"/>
+        </w:rPr>
+        <w:t>事件鏈</w:t>
+      </w:r>
+      <w:r>
+        <w:rPr>
+          <w:rFonts w:ascii="PMingLiU" w:eastAsia="PMingLiU" w:hAnsi="PMingLiU" w:hint="eastAsia"/>
+          <w:color w:val="000000" w:themeColor="text1"/>
+          <w:sz w:val="22"/>
+          <w:szCs w:val="22"/>
+        </w:rPr>
+        <w:t>」</w:t>
+      </w:r>
+      <w:r>
+        <w:rPr>
+          <w:rFonts w:ascii="PMingLiU" w:eastAsia="PMingLiU" w:hAnsi="PMingLiU" w:hint="eastAsia"/>
+          <w:color w:val="000000" w:themeColor="text1"/>
+          <w:sz w:val="22"/>
+          <w:szCs w:val="22"/>
+        </w:rPr>
+        <w:t>，沿著事件的時間順序，追蹤戰場消息如何向上傳遞、皇帝的命令如何向下傳達，以及官員如何回應先前的硃批或上諭。</w:t>
+      </w:r>
+    </w:p>
+    <w:p>
+      <w:pPr>
+        <w:rPr>
+          <w:rFonts w:ascii="PMingLiU" w:eastAsia="PMingLiU" w:hAnsi="PMingLiU"/>
+          <w:color w:val="000000" w:themeColor="text1"/>
+          <w:sz w:val="22"/>
+          <w:szCs w:val="22"/>
+        </w:rPr>
+      </w:pPr>
+    </w:p>
+    <w:p>
+      <w:pPr>
+        <w:rPr>
+          <w:rFonts w:ascii="PMingLiU" w:eastAsia="PMingLiU" w:hAnsi="PMingLiU"/>
+          <w:color w:val="000000" w:themeColor="text1"/>
+          <w:sz w:val="22"/>
+          <w:szCs w:val="22"/>
+        </w:rPr>
+      </w:pPr>
+      <w:r>
+        <w:rPr>
+          <w:rFonts w:ascii="PMingLiU" w:eastAsia="PMingLiU" w:hAnsi="PMingLiU"/>
+          <w:color w:val="000000" w:themeColor="text1"/>
+          <w:sz w:val="22"/>
+          <w:szCs w:val="22"/>
+        </w:rPr>
+        <w:tab/>
+      </w:r>
+      <w:r>
+        <w:rPr>
+          <w:rFonts w:ascii="PMingLiU" w:eastAsia="PMingLiU" w:hAnsi="PMingLiU"/>
+          <w:color w:val="000000" w:themeColor="text1"/>
+          <w:sz w:val="22"/>
+          <w:szCs w:val="22"/>
+        </w:rPr>
+        <w:tab/>
+      </w:r>
+      <w:r>
+        <w:rPr>
+          <w:rFonts w:ascii="PMingLiU" w:eastAsia="PMingLiU" w:hAnsi="PMingLiU" w:hint="eastAsia"/>
+          <w:color w:val="000000" w:themeColor="text1"/>
+          <w:sz w:val="22"/>
+          <w:szCs w:val="22"/>
+        </w:rPr>
+        <w:t xml:space="preserve">3. </w:t>
+      </w:r>
+      <w:r>
+        <w:rPr>
+          <w:rFonts w:ascii="PMingLiU" w:eastAsia="PMingLiU" w:hAnsi="PMingLiU" w:hint="eastAsia"/>
+          <w:color w:val="000000" w:themeColor="text1"/>
+          <w:sz w:val="22"/>
+          <w:szCs w:val="22"/>
+        </w:rPr>
+        <w:t>時間與關係圖表</w:t>
+      </w:r>
+    </w:p>
+    <w:p>
+      <w:pPr>
+        <w:rPr>
+          <w:rFonts w:ascii="PMingLiU" w:eastAsia="PMingLiU" w:hAnsi="PMingLiU"/>
+          <w:color w:val="000000" w:themeColor="text1"/>
+          <w:sz w:val="22"/>
+          <w:szCs w:val="22"/>
+        </w:rPr>
+      </w:pPr>
+      <w:r>
+        <w:rPr>
+          <w:rFonts w:ascii="PMingLiU" w:eastAsia="PMingLiU" w:hAnsi="PMingLiU" w:hint="eastAsia"/>
+          <w:color w:val="000000" w:themeColor="text1"/>
+          <w:sz w:val="22"/>
+          <w:szCs w:val="22"/>
+        </w:rPr>
+        <w:t>時間與關係圖表位於介面的主要區域，用以呈現文書</w:t>
+      </w:r>
+      <w:r>
+        <w:rPr>
+          <w:rFonts w:ascii="PMingLiU" w:eastAsia="PMingLiU" w:hAnsi="PMingLiU" w:hint="eastAsia"/>
+          <w:color w:val="000000" w:themeColor="text1"/>
+          <w:sz w:val="22"/>
+          <w:szCs w:val="22"/>
+        </w:rPr>
+        <w:t>和</w:t>
+      </w:r>
+      <w:r>
+        <w:rPr>
+          <w:rFonts w:ascii="PMingLiU" w:eastAsia="PMingLiU" w:hAnsi="PMingLiU" w:hint="eastAsia"/>
+          <w:color w:val="000000" w:themeColor="text1"/>
+          <w:sz w:val="22"/>
+          <w:szCs w:val="22"/>
+        </w:rPr>
+        <w:t>事件的</w:t>
+      </w:r>
+      <w:r>
+        <w:rPr>
+          <w:rFonts w:ascii="PMingLiU" w:eastAsia="PMingLiU" w:hAnsi="PMingLiU" w:hint="eastAsia"/>
+          <w:color w:val="000000" w:themeColor="text1"/>
+          <w:sz w:val="22"/>
+          <w:szCs w:val="22"/>
+        </w:rPr>
+        <w:t>時間及傳遞</w:t>
+      </w:r>
+      <w:r>
+        <w:rPr>
+          <w:rFonts w:ascii="PMingLiU" w:eastAsia="PMingLiU" w:hAnsi="PMingLiU" w:hint="eastAsia"/>
+          <w:color w:val="000000" w:themeColor="text1"/>
+          <w:sz w:val="22"/>
+          <w:szCs w:val="22"/>
+        </w:rPr>
+        <w:t>關係。</w:t>
+      </w:r>
+    </w:p>
+    <w:p>
+      <w:pPr>
+        <w:rPr>
+          <w:rFonts w:ascii="PMingLiU" w:eastAsia="PMingLiU" w:hAnsi="PMingLiU"/>
+          <w:color w:val="000000" w:themeColor="text1"/>
+          <w:sz w:val="22"/>
+          <w:szCs w:val="22"/>
+        </w:rPr>
+      </w:pPr>
+    </w:p>
+    <w:p>
+      <w:pPr>
+        <w:rPr>
+          <w:rFonts w:ascii="PMingLiU" w:eastAsia="PMingLiU" w:hAnsi="PMingLiU"/>
+          <w:color w:val="000000" w:themeColor="text1"/>
+          <w:sz w:val="22"/>
+          <w:szCs w:val="22"/>
+        </w:rPr>
+      </w:pPr>
+      <w:r>
+        <w:rPr>
+          <w:rFonts w:ascii="PMingLiU" w:eastAsia="PMingLiU" w:hAnsi="PMingLiU" w:hint="eastAsia"/>
+          <w:color w:val="000000" w:themeColor="text1"/>
+          <w:sz w:val="22"/>
+          <w:szCs w:val="22"/>
+        </w:rPr>
+        <w:t>時間與關係圖表由四條事件線組成，中間兩條線「官員上奏」</w:t>
+      </w:r>
+      <w:r>
+        <w:rPr>
+          <w:rFonts w:ascii="PMingLiU" w:eastAsia="PMingLiU" w:hAnsi="PMingLiU" w:hint="eastAsia"/>
+          <w:color w:val="000000" w:themeColor="text1"/>
+          <w:sz w:val="22"/>
+          <w:szCs w:val="22"/>
+        </w:rPr>
+        <w:t>及</w:t>
+      </w:r>
+      <w:r>
+        <w:rPr>
+          <w:rFonts w:ascii="PMingLiU" w:eastAsia="PMingLiU" w:hAnsi="PMingLiU" w:hint="eastAsia"/>
+          <w:color w:val="000000" w:themeColor="text1"/>
+          <w:sz w:val="22"/>
+          <w:szCs w:val="22"/>
+        </w:rPr>
+        <w:t>「皇帝硃批下旨」呈現文書的發送及接收時間</w:t>
+      </w:r>
+      <w:r>
+        <w:rPr>
+          <w:rFonts w:ascii="PMingLiU" w:eastAsia="PMingLiU" w:hAnsi="PMingLiU" w:hint="eastAsia"/>
+          <w:color w:val="000000" w:themeColor="text1"/>
+          <w:sz w:val="22"/>
+          <w:szCs w:val="22"/>
+        </w:rPr>
+        <w:t>，資料來源自</w:t>
+      </w:r>
+      <w:r>
+        <w:rPr>
+          <w:rFonts w:ascii="PMingLiU" w:eastAsia="PMingLiU" w:hAnsi="PMingLiU" w:hint="eastAsia"/>
+          <w:color w:val="000000" w:themeColor="text1"/>
+          <w:sz w:val="22"/>
+          <w:szCs w:val="22"/>
+        </w:rPr>
+        <w:t>原始</w:t>
+      </w:r>
+      <w:r>
+        <w:rPr>
+          <w:rFonts w:ascii="PMingLiU" w:eastAsia="PMingLiU" w:hAnsi="PMingLiU" w:hint="eastAsia"/>
+          <w:color w:val="000000" w:themeColor="text1"/>
+          <w:sz w:val="22"/>
+          <w:szCs w:val="22"/>
+        </w:rPr>
+        <w:t>文本中已有的收發時間。</w:t>
+      </w:r>
+      <w:r>
+        <w:rPr>
+          <w:rFonts w:ascii="PMingLiU" w:eastAsia="PMingLiU" w:hAnsi="PMingLiU" w:hint="eastAsia"/>
+          <w:color w:val="000000" w:themeColor="text1"/>
+          <w:sz w:val="22"/>
+          <w:szCs w:val="22"/>
+        </w:rPr>
+        <w:t>一</w:t>
+      </w:r>
+      <w:r>
+        <w:rPr>
+          <w:rFonts w:ascii="PMingLiU" w:eastAsia="PMingLiU" w:hAnsi="PMingLiU" w:hint="eastAsia"/>
+          <w:color w:val="000000" w:themeColor="text1"/>
+          <w:sz w:val="22"/>
+          <w:szCs w:val="22"/>
+        </w:rPr>
+        <w:t>個</w:t>
+      </w:r>
+      <w:r>
+        <w:rPr>
+          <w:rFonts w:ascii="PMingLiU" w:eastAsia="PMingLiU" w:hAnsi="PMingLiU" w:hint="eastAsia"/>
+          <w:color w:val="000000" w:themeColor="text1"/>
+          <w:sz w:val="22"/>
+          <w:szCs w:val="22"/>
+        </w:rPr>
+        <w:t>節</w:t>
+      </w:r>
+      <w:r>
+        <w:rPr>
+          <w:rFonts w:ascii="PMingLiU" w:eastAsia="PMingLiU" w:hAnsi="PMingLiU" w:hint="eastAsia"/>
+          <w:color w:val="000000" w:themeColor="text1"/>
+          <w:sz w:val="22"/>
+          <w:szCs w:val="22"/>
+        </w:rPr>
+        <w:t>點代表一份文書。</w:t>
+      </w:r>
+    </w:p>
+    <w:p>
+      <w:pPr>
+        <w:rPr>
+          <w:rFonts w:ascii="PMingLiU" w:eastAsia="PMingLiU" w:hAnsi="PMingLiU"/>
+          <w:color w:val="000000" w:themeColor="text1"/>
+          <w:sz w:val="22"/>
+          <w:szCs w:val="22"/>
+        </w:rPr>
+      </w:pPr>
+    </w:p>
+    <w:p>
+      <w:pPr>
+        <w:rPr>
+          <w:rFonts w:ascii="PMingLiU" w:eastAsia="PMingLiU" w:hAnsi="PMingLiU"/>
+          <w:color w:val="000000" w:themeColor="text1"/>
+          <w:sz w:val="22"/>
+          <w:szCs w:val="22"/>
+        </w:rPr>
+      </w:pPr>
+      <w:r>
+        <w:rPr>
+          <w:rFonts w:ascii="PMingLiU" w:eastAsia="PMingLiU" w:hAnsi="PMingLiU" w:hint="eastAsia"/>
+          <w:color w:val="000000" w:themeColor="text1"/>
+          <w:sz w:val="22"/>
+          <w:szCs w:val="22"/>
+        </w:rPr>
+        <w:lastRenderedPageBreak/>
+        <w:t>兩側的事件線是「奏報事件」和「皇帝行動」，其中的節點分別由「官員上奏」和「皇帝硃批下旨」的節點延伸而成。這些事件首先由 AI 從原始文書中提取，再由研究者閱讀原文查證</w:t>
+      </w:r>
+      <w:r>
+        <w:rPr>
+          <w:rFonts w:ascii="PMingLiU" w:eastAsia="PMingLiU" w:hAnsi="PMingLiU" w:hint="eastAsia"/>
+          <w:color w:val="000000" w:themeColor="text1"/>
+          <w:sz w:val="22"/>
+          <w:szCs w:val="22"/>
+        </w:rPr>
+        <w:t>，</w:t>
+      </w:r>
+      <w:r>
+        <w:rPr>
+          <w:rFonts w:ascii="PMingLiU" w:eastAsia="PMingLiU" w:hAnsi="PMingLiU" w:hint="eastAsia"/>
+          <w:color w:val="000000" w:themeColor="text1"/>
+          <w:sz w:val="22"/>
+          <w:szCs w:val="22"/>
+        </w:rPr>
+        <w:t>經確認後，才會以節點形式加入圖表。</w:t>
+      </w:r>
+    </w:p>
+    <w:p>
+      <w:pPr>
+        <w:rPr>
+          <w:rFonts w:ascii="PMingLiU" w:eastAsia="PMingLiU" w:hAnsi="PMingLiU" w:hint="eastAsia"/>
+          <w:color w:val="000000" w:themeColor="text1"/>
+          <w:sz w:val="22"/>
+          <w:szCs w:val="22"/>
+        </w:rPr>
+      </w:pPr>
+    </w:p>
+    <w:p>
+      <w:pPr>
+        <w:rPr>
+          <w:rFonts w:ascii="PMingLiU" w:eastAsia="PMingLiU" w:hAnsi="PMingLiU"/>
+          <w:color w:val="000000" w:themeColor="text1"/>
+          <w:sz w:val="22"/>
+          <w:szCs w:val="22"/>
+        </w:rPr>
+      </w:pPr>
+      <w:r>
+        <w:rPr>
+          <w:rFonts w:ascii="PMingLiU" w:eastAsia="PMingLiU" w:hAnsi="PMingLiU" w:hint="eastAsia"/>
+          <w:color w:val="000000" w:themeColor="text1"/>
+          <w:sz w:val="22"/>
+          <w:szCs w:val="22"/>
+        </w:rPr>
+        <w:t>四條線上的文書和事件</w:t>
+      </w:r>
+      <w:r>
+        <w:rPr>
+          <w:rFonts w:ascii="PMingLiU" w:eastAsia="PMingLiU" w:hAnsi="PMingLiU" w:hint="eastAsia"/>
+          <w:color w:val="000000" w:themeColor="text1"/>
+          <w:sz w:val="22"/>
+          <w:szCs w:val="22"/>
+        </w:rPr>
+        <w:t>節點</w:t>
+      </w:r>
+      <w:r>
+        <w:rPr>
+          <w:rFonts w:ascii="PMingLiU" w:eastAsia="PMingLiU" w:hAnsi="PMingLiU" w:hint="eastAsia"/>
+          <w:color w:val="000000" w:themeColor="text1"/>
+          <w:sz w:val="22"/>
+          <w:szCs w:val="22"/>
+        </w:rPr>
+        <w:t>，會按照時間順序排列，並透過連線呈現彼此的傳遞關係。</w:t>
+      </w:r>
+    </w:p>
+    <w:p>
+      <w:pPr>
+        <w:rPr>
+          <w:rFonts w:ascii="PMingLiU" w:eastAsia="PMingLiU" w:hAnsi="PMingLiU"/>
+          <w:color w:val="000000" w:themeColor="text1"/>
+          <w:sz w:val="22"/>
+          <w:szCs w:val="22"/>
+        </w:rPr>
+      </w:pPr>
+    </w:p>
+    <w:p>
+      <w:pPr>
+        <w:rPr>
+          <w:rFonts w:ascii="PMingLiU" w:eastAsia="PMingLiU" w:hAnsi="PMingLiU"/>
+          <w:color w:val="000000" w:themeColor="text1"/>
+          <w:sz w:val="22"/>
+          <w:szCs w:val="22"/>
+        </w:rPr>
+      </w:pPr>
+      <w:r>
+        <w:rPr>
+          <w:rFonts w:ascii="PMingLiU" w:eastAsia="PMingLiU" w:hAnsi="PMingLiU" w:hint="eastAsia"/>
+          <w:color w:val="000000" w:themeColor="text1"/>
+          <w:sz w:val="22"/>
+          <w:szCs w:val="22"/>
+        </w:rPr>
+        <w:t>研究者可以點擊任何節點，查看該文書或事件的詳細資料</w:t>
+      </w:r>
+      <w:r>
+        <w:rPr>
+          <w:rFonts w:ascii="PMingLiU" w:eastAsia="PMingLiU" w:hAnsi="PMingLiU" w:hint="eastAsia"/>
+          <w:color w:val="000000" w:themeColor="text1"/>
+          <w:sz w:val="22"/>
+          <w:szCs w:val="22"/>
+        </w:rPr>
+        <w:t>，或</w:t>
+      </w:r>
+      <w:r>
+        <w:rPr>
+          <w:rFonts w:ascii="PMingLiU" w:eastAsia="PMingLiU" w:hAnsi="PMingLiU" w:hint="eastAsia"/>
+          <w:color w:val="000000" w:themeColor="text1"/>
+          <w:sz w:val="22"/>
+          <w:szCs w:val="22"/>
+        </w:rPr>
+        <w:t>進一步</w:t>
+      </w:r>
+      <w:r>
+        <w:rPr>
+          <w:rFonts w:ascii="PMingLiU" w:eastAsia="PMingLiU" w:hAnsi="PMingLiU" w:hint="eastAsia"/>
+          <w:color w:val="000000" w:themeColor="text1"/>
+          <w:sz w:val="22"/>
+          <w:szCs w:val="22"/>
+        </w:rPr>
+        <w:t>點擊「</w:t>
+      </w:r>
+      <w:r>
+        <w:rPr>
+          <w:rFonts w:ascii="PMingLiU" w:eastAsia="PMingLiU" w:hAnsi="PMingLiU" w:hint="eastAsia"/>
+          <w:color w:val="000000" w:themeColor="text1"/>
+          <w:sz w:val="22"/>
+          <w:szCs w:val="22"/>
+        </w:rPr>
+        <w:t>事件鏈</w:t>
+      </w:r>
+      <w:r>
+        <w:rPr>
+          <w:rFonts w:ascii="PMingLiU" w:eastAsia="PMingLiU" w:hAnsi="PMingLiU" w:hint="eastAsia"/>
+          <w:color w:val="000000" w:themeColor="text1"/>
+          <w:sz w:val="22"/>
+          <w:szCs w:val="22"/>
+        </w:rPr>
+        <w:t>」</w:t>
+      </w:r>
+      <w:r>
+        <w:rPr>
+          <w:rFonts w:ascii="PMingLiU" w:eastAsia="PMingLiU" w:hAnsi="PMingLiU" w:hint="eastAsia"/>
+          <w:color w:val="000000" w:themeColor="text1"/>
+          <w:sz w:val="22"/>
+          <w:szCs w:val="22"/>
+        </w:rPr>
+        <w:t>，</w:t>
+      </w:r>
+      <w:r>
+        <w:rPr>
+          <w:rFonts w:ascii="PMingLiU" w:eastAsia="PMingLiU" w:hAnsi="PMingLiU" w:hint="eastAsia"/>
+          <w:color w:val="000000" w:themeColor="text1"/>
+          <w:sz w:val="22"/>
+          <w:szCs w:val="22"/>
+        </w:rPr>
+        <w:t>沿著時間順序</w:t>
+      </w:r>
+      <w:r>
+        <w:rPr>
+          <w:rFonts w:ascii="PMingLiU" w:eastAsia="PMingLiU" w:hAnsi="PMingLiU" w:hint="eastAsia"/>
+          <w:color w:val="000000" w:themeColor="text1"/>
+          <w:sz w:val="22"/>
+          <w:szCs w:val="22"/>
+        </w:rPr>
+        <w:t>，</w:t>
+      </w:r>
+      <w:r>
+        <w:rPr>
+          <w:rFonts w:ascii="PMingLiU" w:eastAsia="PMingLiU" w:hAnsi="PMingLiU" w:hint="eastAsia"/>
+          <w:color w:val="000000" w:themeColor="text1"/>
+          <w:sz w:val="22"/>
+          <w:szCs w:val="22"/>
+        </w:rPr>
+        <w:t>了解相關文書</w:t>
+      </w:r>
+      <w:r>
+        <w:rPr>
+          <w:rFonts w:ascii="PMingLiU" w:eastAsia="PMingLiU" w:hAnsi="PMingLiU" w:hint="eastAsia"/>
+          <w:color w:val="000000" w:themeColor="text1"/>
+          <w:sz w:val="22"/>
+          <w:szCs w:val="22"/>
+        </w:rPr>
+        <w:t>和</w:t>
+      </w:r>
+      <w:r>
+        <w:rPr>
+          <w:rFonts w:ascii="PMingLiU" w:eastAsia="PMingLiU" w:hAnsi="PMingLiU" w:hint="eastAsia"/>
+          <w:color w:val="000000" w:themeColor="text1"/>
+          <w:sz w:val="22"/>
+          <w:szCs w:val="22"/>
+        </w:rPr>
+        <w:t>事件</w:t>
+      </w:r>
+      <w:r>
+        <w:rPr>
+          <w:rFonts w:ascii="PMingLiU" w:eastAsia="PMingLiU" w:hAnsi="PMingLiU" w:hint="eastAsia"/>
+          <w:color w:val="000000" w:themeColor="text1"/>
+          <w:sz w:val="22"/>
+          <w:szCs w:val="22"/>
+        </w:rPr>
+        <w:t>的具體</w:t>
+      </w:r>
+      <w:r>
+        <w:rPr>
+          <w:rFonts w:ascii="PMingLiU" w:eastAsia="PMingLiU" w:hAnsi="PMingLiU" w:hint="eastAsia"/>
+          <w:color w:val="000000" w:themeColor="text1"/>
+          <w:sz w:val="22"/>
+          <w:szCs w:val="22"/>
+        </w:rPr>
+        <w:t>傳遞關係。</w:t>
+      </w:r>
+    </w:p>
+    <w:p>
+      <w:pPr>
+        <w:rPr>
+          <w:rFonts w:ascii="PMingLiU" w:eastAsia="PMingLiU" w:hAnsi="PMingLiU"/>
+          <w:color w:val="000000" w:themeColor="text1"/>
+          <w:sz w:val="22"/>
+          <w:szCs w:val="22"/>
+        </w:rPr>
+      </w:pPr>
+    </w:p>
+    <w:p>
+      <w:pPr>
+        <w:rPr>
+          <w:rFonts w:ascii="PMingLiU" w:eastAsia="PMingLiU" w:hAnsi="PMingLiU"/>
+          <w:color w:val="000000" w:themeColor="text1"/>
+          <w:sz w:val="22"/>
+          <w:szCs w:val="22"/>
+        </w:rPr>
+      </w:pPr>
+      <w:r>
+        <w:rPr>
+          <w:rFonts w:ascii="PMingLiU" w:eastAsia="PMingLiU" w:hAnsi="PMingLiU"/>
+          <w:color w:val="000000" w:themeColor="text1"/>
+          <w:sz w:val="22"/>
+          <w:szCs w:val="22"/>
+        </w:rPr>
+        <w:tab/>
+      </w:r>
+      <w:r>
+        <w:rPr>
+          <w:rFonts w:ascii="PMingLiU" w:eastAsia="PMingLiU" w:hAnsi="PMingLiU"/>
+          <w:color w:val="000000" w:themeColor="text1"/>
+          <w:sz w:val="22"/>
+          <w:szCs w:val="22"/>
+        </w:rPr>
+        <w:tab/>
+      </w:r>
+      <w:r>
+        <w:rPr>
+          <w:rFonts w:ascii="PMingLiU" w:eastAsia="PMingLiU" w:hAnsi="PMingLiU" w:hint="eastAsia"/>
+          <w:color w:val="000000" w:themeColor="text1"/>
+          <w:sz w:val="22"/>
+          <w:szCs w:val="22"/>
+        </w:rPr>
+        <w:t>5</w:t>
+      </w:r>
+      <w:r>
+        <w:rPr>
+          <w:rFonts w:ascii="PMingLiU" w:eastAsia="PMingLiU" w:hAnsi="PMingLiU" w:hint="eastAsia"/>
+          <w:color w:val="000000" w:themeColor="text1"/>
+          <w:sz w:val="22"/>
+          <w:szCs w:val="22"/>
+        </w:rPr>
+        <w:t xml:space="preserve">. </w:t>
+      </w:r>
+      <w:r>
+        <w:rPr>
+          <w:rFonts w:ascii="PMingLiU" w:eastAsia="PMingLiU" w:hAnsi="PMingLiU" w:hint="eastAsia"/>
+          <w:color w:val="000000" w:themeColor="text1"/>
+          <w:sz w:val="22"/>
+          <w:szCs w:val="22"/>
+        </w:rPr>
+        <w:t>節點資訊區</w:t>
+      </w:r>
+    </w:p>
+    <w:p>
+      <w:pPr>
+        <w:rPr>
+          <w:rFonts w:ascii="PMingLiU" w:eastAsia="PMingLiU" w:hAnsi="PMingLiU"/>
+          <w:color w:val="000000" w:themeColor="text1"/>
+          <w:sz w:val="22"/>
+          <w:szCs w:val="22"/>
+        </w:rPr>
+      </w:pPr>
+      <w:r>
+        <w:rPr>
+          <w:rFonts w:ascii="PMingLiU" w:eastAsia="PMingLiU" w:hAnsi="PMingLiU" w:hint="eastAsia"/>
+          <w:color w:val="000000" w:themeColor="text1"/>
+          <w:sz w:val="22"/>
+          <w:szCs w:val="22"/>
+        </w:rPr>
+        <w:t>當研究者點擊圖表上的節點時，介面會開啟獨立的資訊面板，顯示該節點的完整 AI 提取結果，包括標題、描述、時間、原文引文及史料來源。</w:t>
+      </w:r>
+    </w:p>
+    <w:p>
+      <w:pPr>
+        <w:rPr>
+          <w:rFonts w:ascii="PMingLiU" w:eastAsia="PMingLiU" w:hAnsi="PMingLiU" w:hint="eastAsia"/>
+          <w:color w:val="000000" w:themeColor="text1"/>
+          <w:sz w:val="22"/>
+          <w:szCs w:val="22"/>
+        </w:rPr>
+      </w:pPr>
+    </w:p>
+    <w:p>
+      <w:pPr>
+        <w:rPr>
+          <w:rFonts w:ascii="PMingLiU" w:eastAsia="PMingLiU" w:hAnsi="PMingLiU"/>
+          <w:color w:val="000000" w:themeColor="text1"/>
+          <w:sz w:val="22"/>
+          <w:szCs w:val="22"/>
+        </w:rPr>
+      </w:pPr>
+      <w:r>
+        <w:rPr>
+          <w:rFonts w:ascii="PMingLiU" w:eastAsia="PMingLiU" w:hAnsi="PMingLiU"/>
+          <w:color w:val="000000" w:themeColor="text1"/>
+          <w:sz w:val="22"/>
+          <w:szCs w:val="22"/>
+        </w:rPr>
+        <w:tab/>
+      </w:r>
+      <w:r>
+        <w:rPr>
+          <w:rFonts w:ascii="PMingLiU" w:eastAsia="PMingLiU" w:hAnsi="PMingLiU"/>
+          <w:color w:val="000000" w:themeColor="text1"/>
+          <w:sz w:val="22"/>
+          <w:szCs w:val="22"/>
+        </w:rPr>
+        <w:tab/>
+      </w:r>
+      <w:r>
+        <w:rPr>
+          <w:rFonts w:ascii="PMingLiU" w:eastAsia="PMingLiU" w:hAnsi="PMingLiU" w:hint="eastAsia"/>
+          <w:color w:val="000000" w:themeColor="text1"/>
+          <w:sz w:val="22"/>
+          <w:szCs w:val="22"/>
+        </w:rPr>
+        <w:t>6</w:t>
+      </w:r>
+      <w:r>
+        <w:rPr>
+          <w:rFonts w:ascii="PMingLiU" w:eastAsia="PMingLiU" w:hAnsi="PMingLiU" w:hint="eastAsia"/>
+          <w:color w:val="000000" w:themeColor="text1"/>
+          <w:sz w:val="22"/>
+          <w:szCs w:val="22"/>
+        </w:rPr>
+        <w:t xml:space="preserve">. </w:t>
+      </w:r>
+      <w:r>
+        <w:rPr>
+          <w:rFonts w:ascii="PMingLiU" w:eastAsia="PMingLiU" w:hAnsi="PMingLiU" w:hint="eastAsia"/>
+          <w:color w:val="000000" w:themeColor="text1"/>
+          <w:sz w:val="22"/>
+          <w:szCs w:val="22"/>
+        </w:rPr>
+        <w:t>原始史料區</w:t>
+      </w:r>
+    </w:p>
+    <w:p>
+      <w:pPr>
+        <w:rPr>
+          <w:rFonts w:ascii="PMingLiU" w:eastAsia="PMingLiU" w:hAnsi="PMingLiU"/>
+          <w:color w:val="000000" w:themeColor="text1"/>
+          <w:sz w:val="22"/>
+          <w:szCs w:val="22"/>
+        </w:rPr>
+      </w:pPr>
+      <w:r>
+        <w:rPr>
+          <w:rFonts w:ascii="PMingLiU" w:eastAsia="PMingLiU" w:hAnsi="PMingLiU" w:hint="eastAsia"/>
+          <w:color w:val="000000" w:themeColor="text1"/>
+          <w:sz w:val="22"/>
+          <w:szCs w:val="22"/>
+        </w:rPr>
+        <w:t>文書區顯示原始文書的完整原文及基本資料，包括標題、文書類型、作者、收發日期和史料出處。</w:t>
+      </w:r>
+    </w:p>
+    <w:p>
+      <w:pPr>
+        <w:rPr>
+          <w:rFonts w:ascii="PMingLiU" w:eastAsia="PMingLiU" w:hAnsi="PMingLiU"/>
+          <w:color w:val="000000" w:themeColor="text1"/>
+          <w:sz w:val="22"/>
+          <w:szCs w:val="22"/>
+        </w:rPr>
+      </w:pPr>
+    </w:p>
+    <w:p>
+      <w:pPr>
+        <w:rPr>
+          <w:rFonts w:ascii="PMingLiU" w:eastAsia="PMingLiU" w:hAnsi="PMingLiU"/>
+          <w:color w:val="000000" w:themeColor="text1"/>
+          <w:sz w:val="22"/>
+          <w:szCs w:val="22"/>
+        </w:rPr>
+      </w:pPr>
+      <w:r>
+        <w:rPr>
+          <w:rFonts w:ascii="PMingLiU" w:eastAsia="PMingLiU" w:hAnsi="PMingLiU" w:hint="eastAsia"/>
+          <w:color w:val="000000" w:themeColor="text1"/>
+          <w:sz w:val="22"/>
+          <w:szCs w:val="22"/>
+        </w:rPr>
+        <w:t>文書區亦設有篩選功能，用以標示不同 AI Skills 的提取結果。研究者可以點擊相</w:t>
+      </w:r>
+      <w:r>
+        <w:rPr>
+          <w:rFonts w:ascii="PMingLiU" w:eastAsia="PMingLiU" w:hAnsi="PMingLiU" w:hint="eastAsia"/>
+          <w:color w:val="000000" w:themeColor="text1"/>
+          <w:sz w:val="22"/>
+          <w:szCs w:val="22"/>
+        </w:rPr>
+        <w:t>關結果的</w:t>
+      </w:r>
+      <w:r>
+        <w:rPr>
+          <w:rFonts w:ascii="PMingLiU" w:eastAsia="PMingLiU" w:hAnsi="PMingLiU" w:hint="eastAsia"/>
+          <w:color w:val="000000" w:themeColor="text1"/>
+          <w:sz w:val="22"/>
+          <w:szCs w:val="22"/>
+        </w:rPr>
+        <w:t>標籤，查看該項結果的完整資訊。</w:t>
+      </w:r>
+    </w:p>
+    <w:p>
+      <w:pPr>
+        <w:rPr>
+          <w:rFonts w:ascii="PMingLiU" w:eastAsia="PMingLiU" w:hAnsi="PMingLiU"/>
+          <w:color w:val="000000" w:themeColor="text1"/>
+          <w:sz w:val="22"/>
+          <w:szCs w:val="22"/>
+        </w:rPr>
+      </w:pPr>
+    </w:p>
+    <w:p>
+      <w:pPr>
+        <w:rPr>
+          <w:rFonts w:ascii="PMingLiU" w:eastAsia="PMingLiU" w:hAnsi="PMingLiU"/>
+          <w:color w:val="000000" w:themeColor="text1"/>
+          <w:sz w:val="22"/>
+          <w:szCs w:val="22"/>
+        </w:rPr>
+      </w:pPr>
+      <w:r>
+        <w:rPr>
+          <w:rFonts w:ascii="PMingLiU" w:eastAsia="PMingLiU" w:hAnsi="PMingLiU"/>
+          <w:color w:val="000000" w:themeColor="text1"/>
+          <w:sz w:val="22"/>
+          <w:szCs w:val="22"/>
+        </w:rPr>
+        <w:tab/>
+      </w:r>
+      <w:r>
+        <w:rPr>
+          <w:rFonts w:ascii="PMingLiU" w:eastAsia="PMingLiU" w:hAnsi="PMingLiU"/>
+          <w:color w:val="000000" w:themeColor="text1"/>
+          <w:sz w:val="22"/>
+          <w:szCs w:val="22"/>
+        </w:rPr>
+        <w:tab/>
+      </w:r>
+      <w:r>
+        <w:rPr>
+          <w:rFonts w:ascii="PMingLiU" w:eastAsia="PMingLiU" w:hAnsi="PMingLiU" w:hint="eastAsia"/>
+          <w:color w:val="000000" w:themeColor="text1"/>
+          <w:sz w:val="22"/>
+          <w:szCs w:val="22"/>
+        </w:rPr>
+        <w:t>7</w:t>
+      </w:r>
+      <w:r>
+        <w:rPr>
+          <w:rFonts w:ascii="PMingLiU" w:eastAsia="PMingLiU" w:hAnsi="PMingLiU" w:hint="eastAsia"/>
+          <w:color w:val="000000" w:themeColor="text1"/>
+          <w:sz w:val="22"/>
+          <w:szCs w:val="22"/>
+        </w:rPr>
+        <w:t>.</w:t>
+      </w:r>
+      <w:r>
+        <w:rPr>
+          <w:rFonts w:ascii="PMingLiU" w:eastAsia="PMingLiU" w:hAnsi="PMingLiU" w:hint="eastAsia"/>
+          <w:color w:val="000000" w:themeColor="text1"/>
+          <w:sz w:val="22"/>
+          <w:szCs w:val="22"/>
+        </w:rPr>
+        <w:t xml:space="preserve"> </w:t>
+      </w:r>
+      <w:r>
+        <w:rPr>
+          <w:rFonts w:ascii="PMingLiU" w:eastAsia="PMingLiU" w:hAnsi="PMingLiU" w:hint="eastAsia"/>
+          <w:color w:val="000000" w:themeColor="text1"/>
+          <w:sz w:val="22"/>
+          <w:szCs w:val="22"/>
+        </w:rPr>
+        <w:t>人工智能分析區</w:t>
+      </w:r>
+    </w:p>
+    <w:p>
+      <w:pPr>
+        <w:rPr>
+          <w:rFonts w:ascii="PMingLiU" w:eastAsia="PMingLiU" w:hAnsi="PMingLiU"/>
+          <w:color w:val="000000" w:themeColor="text1"/>
+          <w:sz w:val="22"/>
+          <w:szCs w:val="22"/>
+        </w:rPr>
+      </w:pPr>
+    </w:p>
+    <w:p>
+      <w:pPr>
+        <w:rPr>
+          <w:rFonts w:ascii="PMingLiU" w:eastAsia="PMingLiU" w:hAnsi="PMingLiU" w:hint="eastAsia"/>
+          <w:color w:val="000000" w:themeColor="text1"/>
+          <w:sz w:val="22"/>
+          <w:szCs w:val="22"/>
+        </w:rPr>
+      </w:pPr>
+      <w:r>
+        <w:rPr>
+          <w:rFonts w:ascii="PMingLiU" w:eastAsia="PMingLiU" w:hAnsi="PMingLiU" w:hint="eastAsia"/>
+          <w:color w:val="000000" w:themeColor="text1"/>
+          <w:sz w:val="22"/>
+          <w:szCs w:val="22"/>
+        </w:rPr>
+        <w:t>研究者可以在本機執行 AI Skills，並將整理後的結構化結果上載至網站。上載後，分析結果會以卡片形式顯示於 AI Chat 面板中。</w:t>
+      </w:r>
+    </w:p>
+    <w:p>
+      <w:pPr>
+        <w:rPr>
+          <w:rFonts w:ascii="PMingLiU" w:eastAsia="PMingLiU" w:hAnsi="PMingLiU"/>
+          <w:color w:val="000000" w:themeColor="text1"/>
+          <w:sz w:val="22"/>
+          <w:szCs w:val="22"/>
+        </w:rPr>
+      </w:pPr>
+    </w:p>
+    <w:p>
+      <w:pPr>
+        <w:rPr>
+          <w:rFonts w:ascii="PMingLiU" w:eastAsia="PMingLiU" w:hAnsi="PMingLiU"/>
+          <w:color w:val="000000" w:themeColor="text1"/>
+          <w:sz w:val="22"/>
+          <w:szCs w:val="22"/>
+        </w:rPr>
+      </w:pPr>
+      <w:r>
+        <w:rPr>
+          <w:rFonts w:ascii="PMingLiU" w:eastAsia="PMingLiU" w:hAnsi="PMingLiU" w:hint="eastAsia"/>
+          <w:color w:val="000000" w:themeColor="text1"/>
+          <w:sz w:val="22"/>
+          <w:szCs w:val="22"/>
+        </w:rPr>
+        <w:t>每張卡片均會列出相關原文引文。研究者可以點擊引文，返回原始文書的相應位置進行核對。</w:t>
+      </w:r>
+    </w:p>
+    <w:p>
+      <w:pPr>
+        <w:rPr>
+          <w:rFonts w:ascii="PMingLiU" w:eastAsia="PMingLiU" w:hAnsi="PMingLiU" w:hint="eastAsia"/>
+          <w:color w:val="000000" w:themeColor="text1"/>
+          <w:sz w:val="22"/>
+          <w:szCs w:val="22"/>
+        </w:rPr>
+      </w:pPr>
+    </w:p>
+    <w:p>
+      <w:pPr>
+        <w:rPr>
+          <w:rFonts w:ascii="PMingLiU" w:eastAsia="PMingLiU" w:hAnsi="PMingLiU"/>
+          <w:color w:val="000000" w:themeColor="text1"/>
+          <w:sz w:val="22"/>
+          <w:szCs w:val="22"/>
+        </w:rPr>
+      </w:pPr>
+      <w:r>
+        <w:rPr>
+          <w:rFonts w:ascii="PMingLiU" w:eastAsia="PMingLiU" w:hAnsi="PMingLiU" w:hint="eastAsia"/>
+          <w:color w:val="000000" w:themeColor="text1"/>
+          <w:sz w:val="22"/>
+          <w:szCs w:val="22"/>
+        </w:rPr>
+        <w:t>確認結果後，研究者可以將其加入圖表，作為獨立事件或事件中的相關資訊；如結果需要修正，研究者可以編輯或拒絕該結果，亦可以手動新增事件。</w:t>
+      </w:r>
+    </w:p>
+    <w:p>
+      <w:pPr>
+        <w:rPr>
+          <w:rFonts w:ascii="PMingLiU" w:eastAsia="PMingLiU" w:hAnsi="PMingLiU"/>
+          <w:color w:val="000000" w:themeColor="text1"/>
+          <w:sz w:val="22"/>
+          <w:szCs w:val="22"/>
+        </w:rPr>
+      </w:pPr>
+    </w:p>
+    <w:p>
+      <w:pPr>
+        <w:rPr>
+          <w:rFonts w:ascii="PMingLiU" w:eastAsia="PMingLiU" w:hAnsi="PMingLiU"/>
+          <w:color w:val="000000" w:themeColor="text1"/>
+          <w:sz w:val="22"/>
+          <w:szCs w:val="22"/>
+        </w:rPr>
+      </w:pPr>
+    </w:p>
+    <w:p>
+      <w:pPr>
+        <w:rPr>
+          <w:rFonts w:ascii="PMingLiU" w:eastAsia="PMingLiU" w:hAnsi="PMingLiU"/>
+          <w:color w:val="000000" w:themeColor="text1"/>
+          <w:sz w:val="22"/>
+          <w:szCs w:val="22"/>
+        </w:rPr>
+      </w:pPr>
+    </w:p>
     <w:sectPr>
       <w:pgSz w:w="11906" w:h="16838"/>
       <w:pgMar w:top="1440" w:right="1440" w:bottom="1440" w:left="1440" w:header="708" w:footer="708" w:gutter="0"/>
@@ -464,7 +2043,6 @@
     <w:next w:val="Normal"/>
     <w:link w:val="Heading3Char"/>
     <w:uiPriority w:val="9"/>
-    <w:semiHidden/>
     <w:unhideWhenUsed/>
     <w:qFormat/>
     <w:rsid w:val="00FE33BC"/>
@@ -672,7 +2250,6 @@
     <w:basedOn w:val="DefaultParagraphFont"/>
     <w:link w:val="Heading3"/>
     <w:uiPriority w:val="9"/>
-    <w:semiHidden/>
     <w:rsid w:val="00FE33BC"/>
     <w:rPr>
       <w:rFonts w:eastAsiaTheme="majorEastAsia" w:cstheme="majorBidi"/>

</xml_diff>